<commit_message>
sync: add latest project files including consulting, business management, and proposal materials
Co-Authored-By: Claude Opus 4.6 <noreply@anthropic.com>
</commit_message>
<xml_diff>
--- a/事務所資料/事務所基本情報/事務所情報.docx
+++ b/事務所資料/事務所基本情報/事務所情報.docx
@@ -51,11 +51,6 @@
       </w:r>
     </w:p>
     <w:p>
-      <w:pPr>
-        <w:rPr>
-          <w:rFonts w:hint="eastAsia"/>
-        </w:rPr>
-      </w:pPr>
       <w:hyperlink r:id="rId6" w:history="1">
         <w:r>
           <w:rPr>
@@ -199,6 +194,34 @@
           <w:rFonts w:hint="eastAsia"/>
         </w:rPr>
         <w:t>というところ。</w:t>
+      </w:r>
+    </w:p>
+    <w:p>
+      <w:r>
+        <w:rPr>
+          <w:rFonts w:hint="eastAsia"/>
+        </w:rPr>
+        <w:t>今期の事業計画としては、シンプルに各事業の月間売上を２０００にもっていくこと。</w:t>
+      </w:r>
+    </w:p>
+    <w:p>
+      <w:pPr>
+        <w:rPr>
+          <w:rFonts w:hint="eastAsia"/>
+        </w:rPr>
+      </w:pPr>
+      <w:r>
+        <w:rPr>
+          <w:rFonts w:hint="eastAsia"/>
+        </w:rPr>
+        <w:t>１については、ＧＭＯペイメントサービス株式会社からの受託、回収が始まり、ここをまず月３００万円程度までもっていく。さらに、新規クライアントで月１００万円を積む。加えて、既存クライアントのうち、小山株式会社からの早期委託を受けることにより、売上を月に１００万円積む。また、それぞれの既存クライアントへの回収効率の向上によ</w:t>
+      </w:r>
+      <w:r>
+        <w:rPr>
+          <w:rFonts w:hint="eastAsia"/>
+        </w:rPr>
+        <w:lastRenderedPageBreak/>
+        <w:t>り、月１００万円を積む。これでおおむね月２０００万円程度になる。</w:t>
       </w:r>
     </w:p>
     <w:p/>

</xml_diff>